<commit_message>
Expand manager report build explanations
</commit_message>
<xml_diff>
--- a/docs/OCM-UBI9-Migration-Manager-Report.docx
+++ b/docs/OCM-UBI9-Migration-Manager-Report.docx
@@ -73,13 +73,7 @@
         <w:spacing w:after="40"/>
       </w:pPr>
       <w:r>
-        <w:rPr>
-          <w:b/>
-        </w:rPr>
-        <w:t xml:space="preserve">Date: </w:t>
-      </w:r>
-      <w:r>
-        <w:t>July 21, 2026</w:t>
+        <w:t>Date: July 23, 2026</w:t>
       </w:r>
     </w:p>
     <w:p>
@@ -2279,6 +2273,20 @@
         <w:t>All five multi-stage Dockerfiles now use registry.access.redhat.com/ubi9/ubi:latest for the runtime stage. Builder stages remain on the existing Go builder, which minimizes upstream divergence. No apt-get, apk, dnf, or package-name conversion was necessary because the runtime stages do not install packages.</w:t>
       </w:r>
     </w:p>
+    <w:p>
+      <w:pPr>
+        <w:spacing w:before="80" w:after="120"/>
+      </w:pPr>
+      <w:r>
+        <w:rPr>
+          <w:b/>
+        </w:rPr>
+        <w:t xml:space="preserve">Dockerfile naming convention. </w:t>
+      </w:r>
+      <w:r>
+        <w:t>OCM builds several component images from one repository, so upstream already uses build/Dockerfile.&lt;component&gt; names—for example, Dockerfile.addon, Dockerfile.work, and Dockerfile.registration. Makefile.org references the same five paths. This migration reused those names; it did not introduce or rename them.</w:t>
+      </w:r>
+    </w:p>
     <w:tbl>
       <w:tblPr>
         <w:tblStyle w:val="TableGrid"/>
@@ -2668,33 +2676,405 @@
       </w:r>
     </w:p>
     <w:p>
+      <w:pPr/>
       <w:r>
-        <w:t>The upstream Makefile is preserved exactly as Makefile.org. A new top-level wrapper exposes the standardized local/SPS interface while delegating upstream build, unit-test, verification, update, and lint behavior back to Makefile.org. Exact .org backups also exist for every modified Dockerfile.</w:t>
+        <w:t>The upstream Makefile is preserved exactly as Makefile.org. The five commands below are new top-level wrapper targets added for a consistent local/SPS-facing interface; they are not targets copied from the original Makefile. Where upstream behavior already exists, the wrapper delegates to Makefile.org. Exact .org backups also exist for every modified Dockerfile.</w:t>
       </w:r>
     </w:p>
     <w:p>
       <w:pPr>
-        <w:keepLines/>
-        <w:spacing w:before="60" w:after="140" w:line="240" w:lineRule="auto"/>
-        <w:ind w:left="259" w:right="259"/>
-        <w:shd w:fill="F5F7F9"/>
+        <w:spacing w:before="100" w:after="80"/>
       </w:pPr>
       <w:r>
         <w:rPr>
-          <w:rFonts w:ascii="Consolas" w:hAnsi="Consolas"/>
-          <w:sz w:val="16"/>
+          <w:b/>
+          <w:color w:val="17365D"/>
         </w:rPr>
-        <w:t>make pre-build</w:t>
-        <w:br/>
-        <w:t>make docker-build</w:t>
-        <w:br/>
-        <w:t>make docker-test</w:t>
-        <w:br/>
-        <w:t>make helm-package</w:t>
-        <w:br/>
-        <w:t>make deploy</w:t>
+        <w:t>Target-by-target explanation</w:t>
       </w:r>
     </w:p>
+    <w:tbl>
+      <w:tblPr>
+        <w:tblStyle w:val="TableGrid"/>
+        <w:tblW w:type="dxa" w:w="10440"/>
+        <w:tblLayout w:type="fixed"/>
+        <w:tblLook w:firstColumn="1" w:firstRow="1" w:lastColumn="0" w:lastRow="0" w:noHBand="0" w:noVBand="1" w:val="04A0"/>
+      </w:tblPr>
+      <w:tblGrid>
+        <w:gridCol w:w="3120"/>
+        <w:gridCol w:w="3120"/>
+        <w:gridCol w:w="3120"/>
+      </w:tblGrid>
+      <w:tr>
+        <w:trPr>
+          <w:tblHeader w:val="true"/>
+        </w:trPr>
+        <w:tc>
+          <w:tcPr>
+            <w:tcW w:type="dxa" w:w="1800"/>
+            <w:shd w:fill="17365D"/>
+            <w:vAlign w:val="center"/>
+          </w:tcPr>
+          <w:p>
+            <w:pPr>
+              <w:spacing w:before="40" w:after="40" w:line="240" w:lineRule="auto"/>
+            </w:pPr>
+            <w:r>
+              <w:rPr>
+                <w:rFonts w:ascii="Arial" w:hAnsi="Arial"/>
+                <w:b/>
+                <w:color w:val="FFFFFF"/>
+                <w:sz w:val="17"/>
+              </w:rPr>
+              <w:t>Target</w:t>
+            </w:r>
+          </w:p>
+        </w:tc>
+        <w:tc>
+          <w:tcPr>
+            <w:tcW w:type="dxa" w:w="3528"/>
+            <w:shd w:fill="17365D"/>
+            <w:vAlign w:val="center"/>
+          </w:tcPr>
+          <w:p>
+            <w:pPr>
+              <w:spacing w:before="40" w:after="40" w:line="240" w:lineRule="auto"/>
+            </w:pPr>
+            <w:r>
+              <w:rPr>
+                <w:rFonts w:ascii="Arial" w:hAnsi="Arial"/>
+                <w:b/>
+                <w:color w:val="FFFFFF"/>
+                <w:sz w:val="17"/>
+              </w:rPr>
+              <w:t>Why it was added</w:t>
+            </w:r>
+          </w:p>
+        </w:tc>
+        <w:tc>
+          <w:tcPr>
+            <w:tcW w:type="dxa" w:w="5112"/>
+            <w:shd w:fill="17365D"/>
+            <w:vAlign w:val="center"/>
+          </w:tcPr>
+          <w:p>
+            <w:pPr>
+              <w:spacing w:before="40" w:after="40" w:line="240" w:lineRule="auto"/>
+            </w:pPr>
+            <w:r>
+              <w:rPr>
+                <w:rFonts w:ascii="Arial" w:hAnsi="Arial"/>
+                <w:b/>
+                <w:color w:val="FFFFFF"/>
+                <w:sz w:val="17"/>
+              </w:rPr>
+              <w:t>What it does / boundary</w:t>
+            </w:r>
+          </w:p>
+        </w:tc>
+      </w:tr>
+      <w:tr>
+        <w:trPr>
+          <w:cantSplit/>
+        </w:trPr>
+        <w:tc>
+          <w:tcPr>
+            <w:tcW w:type="dxa" w:w="1800"/>
+            <w:vAlign w:val="center"/>
+          </w:tcPr>
+          <w:p>
+            <w:pPr>
+              <w:spacing w:before="40" w:after="40" w:line="240" w:lineRule="auto"/>
+            </w:pPr>
+            <w:r>
+              <w:rPr>
+                <w:rFonts w:ascii="Arial" w:hAnsi="Arial"/>
+                <w:sz w:val="17"/>
+              </w:rPr>
+              <w:t>make pre-build</w:t>
+            </w:r>
+          </w:p>
+        </w:tc>
+        <w:tc>
+          <w:tcPr>
+            <w:tcW w:type="dxa" w:w="3528"/>
+            <w:vAlign w:val="center"/>
+          </w:tcPr>
+          <w:p>
+            <w:pPr>
+              <w:spacing w:before="40" w:after="40" w:line="240" w:lineRule="auto"/>
+            </w:pPr>
+            <w:r>
+              <w:rPr>
+                <w:rFonts w:ascii="Arial" w:hAnsi="Arial"/>
+                <w:sz w:val="17"/>
+              </w:rPr>
+              <w:t>New wrapper target; not in the original Makefile.</w:t>
+            </w:r>
+          </w:p>
+        </w:tc>
+        <w:tc>
+          <w:tcPr>
+            <w:tcW w:type="dxa" w:w="5112"/>
+            <w:vAlign w:val="center"/>
+          </w:tcPr>
+          <w:p>
+            <w:pPr>
+              <w:spacing w:before="40" w:after="40" w:line="240" w:lineRule="auto"/>
+            </w:pPr>
+            <w:r>
+              <w:rPr>
+                <w:rFonts w:ascii="Arial" w:hAnsi="Arial"/>
+                <w:sz w:val="17"/>
+              </w:rPr>
+              <w:t>Checks prerequisites, .org backups, UBI9/non-root Dockerfile rules, and existing Helm charts. It validates readiness; it does not compile binaries or build images.</w:t>
+            </w:r>
+          </w:p>
+        </w:tc>
+      </w:tr>
+      <w:tr>
+        <w:trPr>
+          <w:cantSplit/>
+        </w:trPr>
+        <w:tc>
+          <w:tcPr>
+            <w:tcW w:type="dxa" w:w="1800"/>
+            <w:shd w:fill="F3F5F7"/>
+            <w:vAlign w:val="center"/>
+          </w:tcPr>
+          <w:p>
+            <w:pPr>
+              <w:spacing w:before="40" w:after="40" w:line="240" w:lineRule="auto"/>
+            </w:pPr>
+            <w:r>
+              <w:rPr>
+                <w:rFonts w:ascii="Arial" w:hAnsi="Arial"/>
+                <w:sz w:val="17"/>
+              </w:rPr>
+              <w:t>make docker-build</w:t>
+            </w:r>
+          </w:p>
+        </w:tc>
+        <w:tc>
+          <w:tcPr>
+            <w:tcW w:type="dxa" w:w="3528"/>
+            <w:shd w:fill="F3F5F7"/>
+            <w:vAlign w:val="center"/>
+          </w:tcPr>
+          <w:p>
+            <w:pPr>
+              <w:spacing w:before="40" w:after="40" w:line="240" w:lineRule="auto"/>
+            </w:pPr>
+            <w:r>
+              <w:rPr>
+                <w:rFonts w:ascii="Arial" w:hAnsi="Arial"/>
+                <w:sz w:val="17"/>
+              </w:rPr>
+              <w:t>New aggregate wrapper around existing component Dockerfiles.</w:t>
+            </w:r>
+          </w:p>
+        </w:tc>
+        <w:tc>
+          <w:tcPr>
+            <w:tcW w:type="dxa" w:w="5112"/>
+            <w:shd w:fill="F3F5F7"/>
+            <w:vAlign w:val="center"/>
+          </w:tcPr>
+          <w:p>
+            <w:pPr>
+              <w:spacing w:before="40" w:after="40" w:line="240" w:lineRule="auto"/>
+            </w:pPr>
+            <w:r>
+              <w:rPr>
+                <w:rFonts w:ascii="Arial" w:hAnsi="Arial"/>
+                <w:sz w:val="17"/>
+              </w:rPr>
+              <w:t>Builds all five OCM component images for linux/amd64 using the upstream Dockerfile paths and configurable engine, registry, and tag values.</w:t>
+            </w:r>
+          </w:p>
+        </w:tc>
+      </w:tr>
+      <w:tr>
+        <w:trPr>
+          <w:cantSplit/>
+        </w:trPr>
+        <w:tc>
+          <w:tcPr>
+            <w:tcW w:type="dxa" w:w="1800"/>
+            <w:vAlign w:val="center"/>
+          </w:tcPr>
+          <w:p>
+            <w:pPr>
+              <w:spacing w:before="40" w:after="40" w:line="240" w:lineRule="auto"/>
+            </w:pPr>
+            <w:r>
+              <w:rPr>
+                <w:rFonts w:ascii="Arial" w:hAnsi="Arial"/>
+                <w:sz w:val="17"/>
+              </w:rPr>
+              <w:t>make docker-test</w:t>
+            </w:r>
+          </w:p>
+        </w:tc>
+        <w:tc>
+          <w:tcPr>
+            <w:tcW w:type="dxa" w:w="3528"/>
+            <w:vAlign w:val="center"/>
+          </w:tcPr>
+          <w:p>
+            <w:pPr>
+              <w:spacing w:before="40" w:after="40" w:line="240" w:lineRule="auto"/>
+            </w:pPr>
+            <w:r>
+              <w:rPr>
+                <w:rFonts w:ascii="Arial" w:hAnsi="Arial"/>
+                <w:sz w:val="17"/>
+              </w:rPr>
+              <w:t>New image-validation wrapper; separate from upstream Go tests.</w:t>
+            </w:r>
+          </w:p>
+        </w:tc>
+        <w:tc>
+          <w:tcPr>
+            <w:tcW w:type="dxa" w:w="5112"/>
+            <w:vAlign w:val="center"/>
+          </w:tcPr>
+          <w:p>
+            <w:pPr>
+              <w:spacing w:before="40" w:after="40" w:line="240" w:lineRule="auto"/>
+            </w:pPr>
+            <w:r>
+              <w:rPr>
+                <w:rFonts w:ascii="Arial" w:hAnsi="Arial"/>
+                <w:sz w:val="17"/>
+              </w:rPr>
+              <w:t>Checks UBI9 identity, amd64 architecture, non-root UID 10001, expected executables, and help/startup behavior. It does not replace make test.</w:t>
+            </w:r>
+          </w:p>
+        </w:tc>
+      </w:tr>
+      <w:tr>
+        <w:trPr>
+          <w:cantSplit/>
+        </w:trPr>
+        <w:tc>
+          <w:tcPr>
+            <w:tcW w:type="dxa" w:w="1800"/>
+            <w:shd w:fill="F3F5F7"/>
+            <w:vAlign w:val="center"/>
+          </w:tcPr>
+          <w:p>
+            <w:pPr>
+              <w:spacing w:before="40" w:after="40" w:line="240" w:lineRule="auto"/>
+            </w:pPr>
+            <w:r>
+              <w:rPr>
+                <w:rFonts w:ascii="Arial" w:hAnsi="Arial"/>
+                <w:sz w:val="17"/>
+              </w:rPr>
+              <w:t>make helm-package</w:t>
+            </w:r>
+          </w:p>
+        </w:tc>
+        <w:tc>
+          <w:tcPr>
+            <w:tcW w:type="dxa" w:w="3528"/>
+            <w:shd w:fill="F3F5F7"/>
+            <w:vAlign w:val="center"/>
+          </w:tcPr>
+          <w:p>
+            <w:pPr>
+              <w:spacing w:before="40" w:after="40" w:line="240" w:lineRule="auto"/>
+            </w:pPr>
+            <w:r>
+              <w:rPr>
+                <w:rFonts w:ascii="Arial" w:hAnsi="Arial"/>
+                <w:sz w:val="17"/>
+              </w:rPr>
+              <w:t>New packaging convenience target for the existing charts.</w:t>
+            </w:r>
+          </w:p>
+        </w:tc>
+        <w:tc>
+          <w:tcPr>
+            <w:tcW w:type="dxa" w:w="5112"/>
+            <w:shd w:fill="F3F5F7"/>
+            <w:vAlign w:val="center"/>
+          </w:tcPr>
+          <w:p>
+            <w:pPr>
+              <w:spacing w:before="40" w:after="40" w:line="240" w:lineRule="auto"/>
+            </w:pPr>
+            <w:r>
+              <w:rPr>
+                <w:rFonts w:ascii="Arial" w:hAnsi="Arial"/>
+                <w:sz w:val="17"/>
+              </w:rPr>
+              <w:t>Lints and packages the Cluster Manager and Klusterlet charts with a configurable chart version. It does not publish, sign, or mirror packages.</w:t>
+            </w:r>
+          </w:p>
+        </w:tc>
+      </w:tr>
+      <w:tr>
+        <w:trPr>
+          <w:cantSplit/>
+        </w:trPr>
+        <w:tc>
+          <w:tcPr>
+            <w:tcW w:type="dxa" w:w="1800"/>
+            <w:vAlign w:val="center"/>
+          </w:tcPr>
+          <w:p>
+            <w:pPr>
+              <w:spacing w:before="40" w:after="40" w:line="240" w:lineRule="auto"/>
+            </w:pPr>
+            <w:r>
+              <w:rPr>
+                <w:rFonts w:ascii="Arial" w:hAnsi="Arial"/>
+                <w:sz w:val="17"/>
+              </w:rPr>
+              <w:t>make deploy</w:t>
+            </w:r>
+          </w:p>
+        </w:tc>
+        <w:tc>
+          <w:tcPr>
+            <w:tcW w:type="dxa" w:w="3528"/>
+            <w:vAlign w:val="center"/>
+          </w:tcPr>
+          <w:p>
+            <w:pPr>
+              <w:spacing w:before="40" w:after="40" w:line="240" w:lineRule="auto"/>
+            </w:pPr>
+            <w:r>
+              <w:rPr>
+                <w:rFonts w:ascii="Arial" w:hAnsi="Arial"/>
+                <w:sz w:val="17"/>
+              </w:rPr>
+              <w:t>New local deployment wrapper for the existing hub chart.</w:t>
+            </w:r>
+          </w:p>
+        </w:tc>
+        <w:tc>
+          <w:tcPr>
+            <w:tcW w:type="dxa" w:w="5112"/>
+            <w:vAlign w:val="center"/>
+          </w:tcPr>
+          <w:p>
+            <w:pPr>
+              <w:spacing w:before="40" w:after="40" w:line="240" w:lineRule="auto"/>
+            </w:pPr>
+            <w:r>
+              <w:rPr>
+                <w:rFonts w:ascii="Arial" w:hAnsi="Arial"/>
+                <w:sz w:val="17"/>
+              </w:rPr>
+              <w:t>Installs or upgrades the hub-side OCM components using local UBI9 image overrides. The managed-cluster side remains the separate deploy-managed flow.</w:t>
+            </w:r>
+          </w:p>
+        </w:tc>
+      </w:tr>
+    </w:tbl>
     <w:p>
       <w:r>
         <w:t>A credential-free local pipeline interface is documented; no IBM pipeline execution is claimed. Registry, tag, platform, container engine, chart version, Kubernetes context, and bootstrap kubeconfig remain parameters, and no IBM credentials or namespaces are embedded.</w:t>
@@ -7655,7 +8035,7 @@
         <w:color w:val="666666"/>
         <w:sz w:val="17"/>
       </w:rPr>
-      <w:t xml:space="preserve">Engineering status • July 21, 2026  |  Page </w:t>
+      <w:t xml:space="preserve">Engineering status • July 23, 2026  |  Page </w:t>
     </w:r>
     <w:r>
       <w:fldChar w:fldCharType="begin"/>

</xml_diff>

<commit_message>
Clarify OCM architecture and validation scope
</commit_message>
<xml_diff>
--- a/docs/OCM-UBI9-Migration-Manager-Report.docx
+++ b/docs/OCM-UBI9-Migration-Manager-Report.docx
@@ -2254,6 +2254,86 @@
     </w:p>
     <w:p>
       <w:pPr>
+        <w:pStyle w:val="Heading2"/>
+      </w:pPr>
+      <w:r>
+        <w:t>2.4 How Helm, operators, CRDs, CRs, and images connect</w:t>
+      </w:r>
+    </w:p>
+    <w:p>
+      <w:pPr>
+        <w:spacing w:after="60"/>
+      </w:pPr>
+      <w:r>
+        <w:rPr>
+          <w:b/>
+        </w:rPr>
+        <w:t xml:space="preserve">1. Helm installs the entry point. </w:t>
+      </w:r>
+      <w:r>
+        <w:t>The existing charts install the CustomResourceDefinitions (CRDs), the operator Deployment, and a ClusterManager or Klusterlet custom resource (CR).</w:t>
+      </w:r>
+    </w:p>
+    <w:p>
+      <w:pPr>
+        <w:spacing w:after="60"/>
+      </w:pPr>
+      <w:r>
+        <w:rPr>
+          <w:b/>
+        </w:rPr>
+        <w:t xml:space="preserve">2. The CRD defines the API; the CR requests an instance. </w:t>
+      </w:r>
+      <w:r>
+        <w:t>A CRD teaches Kubernetes the schema for an OCM resource. A CR is a YAML object using that schema to describe desired configuration. A CR is not a container and does not have its own image.</w:t>
+      </w:r>
+    </w:p>
+    <w:p>
+      <w:pPr>
+        <w:spacing w:after="60"/>
+      </w:pPr>
+      <w:r>
+        <w:rPr>
+          <w:b/>
+        </w:rPr>
+        <w:t xml:space="preserve">3. The operator reconciles the request. </w:t>
+      </w:r>
+      <w:r>
+        <w:t>The operator watches the CR and creates or updates standard Kubernetes resources, including Deployments, using the configured image pull specifications.</w:t>
+      </w:r>
+    </w:p>
+    <w:p>
+      <w:pPr>
+        <w:spacing w:after="60"/>
+      </w:pPr>
+      <w:r>
+        <w:rPr>
+          <w:b/>
+        </w:rPr>
+        <w:t xml:space="preserve">4. Application controllers perform the OCM work. </w:t>
+      </w:r>
+      <w:r>
+        <w:t>Registration, Work, Placement, and Add-on pods then connect clusters, schedule placement, deliver manifests, and report status.</w:t>
+      </w:r>
+    </w:p>
+    <w:p>
+      <w:pPr>
+        <w:spacing w:after="120" w:before="80"/>
+        <w:shd w:fill="FFF2CC"/>
+        <w:ind w:left="100" w:right="100"/>
+      </w:pPr>
+      <w:r>
+        <w:rPr>
+          <w:b/>
+        </w:rPr>
+        <w:t xml:space="preserve">Plain-language summary — </w:t>
+      </w:r>
+      <w:r>
+        <w:t>Helm installs the OCM API and operator; the operator installs and continuously maintains the OCM services requested by the CR.</w:t>
+      </w:r>
+    </w:p>
+    <w:p>
+      <w:pPr>
         <w:pStyle w:val="Heading1"/>
       </w:pPr>
       <w:r>
@@ -2271,6 +2351,12 @@
     <w:p>
       <w:r>
         <w:t>All five multi-stage Dockerfiles now use registry.access.redhat.com/ubi9/ubi:latest for the runtime stage. Builder stages remain on the existing Go builder, which minimizes upstream divergence. No apt-get, apk, dnf, or package-name conversion was necessary because the runtime stages do not install packages.</w:t>
+      </w:r>
+    </w:p>
+    <w:p>
+      <w:pPr/>
+      <w:r>
+        <w:t>The requested public UBI9 reference is currently used as a floating :latest tag for local migration validation. Before release, the approved enterprise base should be recorded as an immutable tag or digest so rebuilds are reproducible and auditable.</w:t>
       </w:r>
     </w:p>
     <w:p>
@@ -3095,6 +3181,20 @@
     </w:p>
     <w:p>
       <w:pPr>
+        <w:spacing w:after="120"/>
+      </w:pPr>
+      <w:r>
+        <w:rPr>
+          <w:b/>
+        </w:rPr>
+        <w:t xml:space="preserve">Where image references are defined. </w:t>
+      </w:r>
+      <w:r>
+        <w:t>For local testing, all five image names are set in deploy/local/cluster-manager-ubi9-values.yaml; the Klusterlet-side overrides are in deploy/local/klusterlet-ubi9-values.yaml. Helm renders those values into the operator Deployment and the ClusterManager/Klusterlet CR image pull specifications. The operator then uses those specifications when it creates the application Deployments.</w:t>
+      </w:r>
+    </w:p>
+    <w:p>
+      <w:pPr>
         <w:pStyle w:val="ListBullet"/>
         <w:spacing w:after="120" w:line="264" w:lineRule="auto"/>
         <w:ind w:left="720" w:hanging="360"/>
@@ -3152,6 +3252,22 @@
     <w:p>
       <w:r>
         <w:t>Testing was layered from static packaging checks through live OCM behavior. This separates evidence that an image merely builds from evidence that the platform performs its intended multicluster functions.</w:t>
+      </w:r>
+    </w:p>
+    <w:p>
+      <w:pPr>
+        <w:spacing w:after="120" w:before="80"/>
+        <w:shd w:fill="FFF2CC"/>
+        <w:ind w:left="100" w:right="100"/>
+      </w:pPr>
+      <w:r>
+        <w:rPr>
+          <w:b/>
+        </w:rPr>
+        <w:t xml:space="preserve">Local topology — </w:t>
+      </w:r>
+      <w:r>
+        <w:t>The isolated ocm-ubi9 Minikube profile acted as both the hub and the locally registered managed cluster. This exercises the full registration, placement, work-delivery, and feedback control loop, but it does not prove cross-network behavior, multi-cluster scale, high availability, upgrades, or RKE2 compatibility.</w:t>
       </w:r>
     </w:p>
     <w:tbl>
@@ -5795,6 +5911,12 @@
       </w:r>
     </w:p>
     <w:p>
+      <w:pPr/>
+      <w:r>
+        <w:t>In this report, “hub” means the Kubernetes cluster and OCM control-plane services—not a browser page. OCM is primarily operated through Kubernetes APIs, kubectl, Helm, and automation. The Dashboard is an infrastructure inspection aid and is not an OCM or ACM replacement UI.</w:t>
+      </w:r>
+    </w:p>
+    <w:p>
       <w:pPr>
         <w:keepLines/>
         <w:spacing w:before="60" w:after="140" w:line="240" w:lineRule="auto"/>
@@ -7919,6 +8041,127 @@
         <w:pStyle w:val="Heading1"/>
       </w:pPr>
       <w:r>
+        <w:t>12. Terms used in this report</w:t>
+      </w:r>
+    </w:p>
+    <w:p>
+      <w:pPr>
+        <w:spacing w:after="60"/>
+      </w:pPr>
+      <w:r>
+        <w:rPr>
+          <w:b/>
+        </w:rPr>
+        <w:t xml:space="preserve">OCM (Open Cluster Management): </w:t>
+      </w:r>
+      <w:r>
+        <w:t>The upstream open-source multicluster control plane evaluated in this work.</w:t>
+      </w:r>
+    </w:p>
+    <w:p>
+      <w:pPr>
+        <w:spacing w:after="60"/>
+      </w:pPr>
+      <w:r>
+        <w:rPr>
+          <w:b/>
+        </w:rPr>
+        <w:t xml:space="preserve">ACM (Advanced Cluster Management): </w:t>
+      </w:r>
+      <w:r>
+        <w:t>Red Hat’s broader supported product. OCM supplies core upstream capabilities but does not by itself reproduce every ACM feature or its console.</w:t>
+      </w:r>
+    </w:p>
+    <w:p>
+      <w:pPr>
+        <w:spacing w:after="60"/>
+      </w:pPr>
+      <w:r>
+        <w:rPr>
+          <w:b/>
+        </w:rPr>
+        <w:t xml:space="preserve">Hub cluster: </w:t>
+      </w:r>
+      <w:r>
+        <w:t>The central Kubernetes cluster that stores desired multicluster state and runs OCM’s management controllers.</w:t>
+      </w:r>
+    </w:p>
+    <w:p>
+      <w:pPr>
+        <w:spacing w:after="60"/>
+      </w:pPr>
+      <w:r>
+        <w:rPr>
+          <w:b/>
+        </w:rPr>
+        <w:t xml:space="preserve">Managed cluster: </w:t>
+      </w:r>
+      <w:r>
+        <w:t>A Kubernetes cluster registered with the hub and capable of receiving work.</w:t>
+      </w:r>
+    </w:p>
+    <w:p>
+      <w:pPr>
+        <w:spacing w:after="60"/>
+      </w:pPr>
+      <w:r>
+        <w:rPr>
+          <w:b/>
+        </w:rPr>
+        <w:t xml:space="preserve">Operator: </w:t>
+      </w:r>
+      <w:r>
+        <w:t>A controller that watches OCM custom resources and continuously creates, updates, or repairs the required Kubernetes workloads.</w:t>
+      </w:r>
+    </w:p>
+    <w:p>
+      <w:pPr>
+        <w:spacing w:after="60"/>
+      </w:pPr>
+      <w:r>
+        <w:rPr>
+          <w:b/>
+        </w:rPr>
+        <w:t xml:space="preserve">CRD / CR: </w:t>
+      </w:r>
+      <w:r>
+        <w:t>A CustomResourceDefinition adds a Kubernetes API type; a custom resource is one desired instance of that type. Neither is a separate container image.</w:t>
+      </w:r>
+    </w:p>
+    <w:p>
+      <w:pPr>
+        <w:spacing w:after="60"/>
+      </w:pPr>
+      <w:r>
+        <w:rPr>
+          <w:b/>
+        </w:rPr>
+        <w:t xml:space="preserve">Helm chart: </w:t>
+      </w:r>
+      <w:r>
+        <w:t>A parameterized Kubernetes package used here to install CRDs, operators, and the initial ClusterManager or Klusterlet request.</w:t>
+      </w:r>
+    </w:p>
+    <w:p>
+      <w:pPr>
+        <w:spacing w:after="60"/>
+      </w:pPr>
+      <w:r>
+        <w:rPr>
+          <w:b/>
+        </w:rPr>
+        <w:t xml:space="preserve">SPS wrapper: </w:t>
+      </w:r>
+      <w:r>
+        <w:t>The standardized Makefile-facing interface prepared for pipeline use. Final SPS contract validation remains pending IBM access.</w:t>
+      </w:r>
+    </w:p>
+    <w:p>
+      <w:pPr>
+        <w:pStyle w:val="Heading1"/>
+        <w:pageBreakBefore/>
+      </w:pPr>
+      <w:r>
         <w:t>Appendix A — Reproduction command set</w:t>
       </w:r>
     </w:p>

</xml_diff>